<commit_message>
DA1-I18 - 2nd update - Recreate the demo data with a smaller number of records and greater variation, as described in the Description.
</commit_message>
<xml_diff>
--- a/docs/Demo Data Creation - Codeunit 50602 Documentation.docx
+++ b/docs/Demo Data Creation - Codeunit 50602 Documentation.docx
@@ -1224,12 +1224,12 @@
         <w:pStyle w:val="Heading2"/>
       </w:pPr>
       <w:r>
-        <w:t>4.2 Custom demo days off</w:t>
+        <w:t>4.2 Custom demo days off — 144 rows (final revision)</w:t>
       </w:r>
     </w:p>
     <w:p>
       <w:r>
-        <w:t>8 fixed exceptions relative to the window's start (gStartDate is always a Monday) — the original 4-pattern set, PLUS the same 4 patterns repeated one year later (+52 weeks), so these days off appear spread across the ~2-year demo window instead of clustered only in its first 5 weeks:</w:t>
+        <w:t>This went through several iterations before settling on its final, simplest shape: the original 4-line pattern (Wk2 Tue, Wk3 Wed, Wk3 Thu, Wk5 Mon — all relative offsets from gStartDate, which is always a Monday) is now looped 36 times, with the anchor date shifted forward by 4 weeks each iteration, covering roughly the next 3 years:</w:t>
       </w:r>
     </w:p>
     <w:tbl>
@@ -1264,7 +1264,7 @@
         </w:tc>
         <w:tc>
           <w:tcPr>
-            <w:tcW w:type="dxa" w:w="3118"/>
+            <w:tcW w:type="dxa" w:w="3402"/>
             <w:shd w:val="clear" w:color="auto" w:fill="1F364D"/>
           </w:tcPr>
           <w:p>
@@ -1281,7 +1281,7 @@
         </w:tc>
         <w:tc>
           <w:tcPr>
-            <w:tcW w:type="dxa" w:w="3685"/>
+            <w:tcW w:type="dxa" w:w="3402"/>
             <w:shd w:val="clear" w:color="auto" w:fill="1F364D"/>
           </w:tcPr>
           <w:p>
@@ -1314,29 +1314,29 @@
         </w:tc>
         <w:tc>
           <w:tcPr>
-            <w:tcW w:type="dxa" w:w="3118"/>
-          </w:tcPr>
-          <w:p>
-            <w:r/>
-            <w:r>
-              <w:rPr>
-                <w:sz w:val="19"/>
-              </w:rPr>
-              <w:t>gStartDate + 1W + 1D</w:t>
-            </w:r>
-          </w:p>
-        </w:tc>
-        <w:tc>
-          <w:tcPr>
-            <w:tcW w:type="dxa" w:w="3685"/>
-          </w:tcPr>
-          <w:p>
-            <w:r/>
-            <w:r>
-              <w:rPr>
-                <w:sz w:val="19"/>
-              </w:rPr>
-              <w:t>Tuesday of week 2</w:t>
+            <w:tcW w:type="dxa" w:w="3402"/>
+          </w:tcPr>
+          <w:p>
+            <w:r/>
+            <w:r>
+              <w:rPr>
+                <w:sz w:val="19"/>
+              </w:rPr>
+              <w:t>MonthAnchor + 1W + 1D</w:t>
+            </w:r>
+          </w:p>
+        </w:tc>
+        <w:tc>
+          <w:tcPr>
+            <w:tcW w:type="dxa" w:w="3402"/>
+          </w:tcPr>
+          <w:p>
+            <w:r/>
+            <w:r>
+              <w:rPr>
+                <w:sz w:val="19"/>
+              </w:rPr>
+              <w:t>Tuesday of week 2 relative to each 4-week block</w:t>
             </w:r>
           </w:p>
         </w:tc>
@@ -1358,29 +1358,29 @@
         </w:tc>
         <w:tc>
           <w:tcPr>
-            <w:tcW w:type="dxa" w:w="3118"/>
-          </w:tcPr>
-          <w:p>
-            <w:r/>
-            <w:r>
-              <w:rPr>
-                <w:sz w:val="19"/>
-              </w:rPr>
-              <w:t>gStartDate + 2W + 2D</w:t>
-            </w:r>
-          </w:p>
-        </w:tc>
-        <w:tc>
-          <w:tcPr>
-            <w:tcW w:type="dxa" w:w="3685"/>
-          </w:tcPr>
-          <w:p>
-            <w:r/>
-            <w:r>
-              <w:rPr>
-                <w:sz w:val="19"/>
-              </w:rPr>
-              <w:t>Wednesday of week 3</w:t>
+            <w:tcW w:type="dxa" w:w="3402"/>
+          </w:tcPr>
+          <w:p>
+            <w:r/>
+            <w:r>
+              <w:rPr>
+                <w:sz w:val="19"/>
+              </w:rPr>
+              <w:t>MonthAnchor + 2W + 2D</w:t>
+            </w:r>
+          </w:p>
+        </w:tc>
+        <w:tc>
+          <w:tcPr>
+            <w:tcW w:type="dxa" w:w="3402"/>
+          </w:tcPr>
+          <w:p>
+            <w:r/>
+            <w:r>
+              <w:rPr>
+                <w:sz w:val="19"/>
+              </w:rPr>
+              <w:t>Wednesday of week 3 relative to each 4-week block</w:t>
             </w:r>
           </w:p>
         </w:tc>
@@ -1402,21 +1402,21 @@
         </w:tc>
         <w:tc>
           <w:tcPr>
-            <w:tcW w:type="dxa" w:w="3118"/>
-          </w:tcPr>
-          <w:p>
-            <w:r/>
-            <w:r>
-              <w:rPr>
-                <w:sz w:val="19"/>
-              </w:rPr>
-              <w:t>gStartDate + 2W + 3D</w:t>
-            </w:r>
-          </w:p>
-        </w:tc>
-        <w:tc>
-          <w:tcPr>
-            <w:tcW w:type="dxa" w:w="3685"/>
+            <w:tcW w:type="dxa" w:w="3402"/>
+          </w:tcPr>
+          <w:p>
+            <w:r/>
+            <w:r>
+              <w:rPr>
+                <w:sz w:val="19"/>
+              </w:rPr>
+              <w:t>MonthAnchor + 2W + 3D</w:t>
+            </w:r>
+          </w:p>
+        </w:tc>
+        <w:tc>
+          <w:tcPr>
+            <w:tcW w:type="dxa" w:w="3402"/>
           </w:tcPr>
           <w:p>
             <w:r/>
@@ -1446,36 +1446,6 @@
         </w:tc>
         <w:tc>
           <w:tcPr>
-            <w:tcW w:type="dxa" w:w="3118"/>
-          </w:tcPr>
-          <w:p>
-            <w:r/>
-            <w:r>
-              <w:rPr>
-                <w:sz w:val="19"/>
-              </w:rPr>
-              <w:t>gStartDate + 4W</w:t>
-            </w:r>
-          </w:p>
-        </w:tc>
-        <w:tc>
-          <w:tcPr>
-            <w:tcW w:type="dxa" w:w="3685"/>
-          </w:tcPr>
-          <w:p>
-            <w:r/>
-            <w:r>
-              <w:rPr>
-                <w:sz w:val="19"/>
-              </w:rPr>
-              <w:t>Monday of week 5</w:t>
-            </w:r>
-          </w:p>
-        </w:tc>
-      </w:tr>
-      <w:tr>
-        <w:tc>
-          <w:tcPr>
             <w:tcW w:type="dxa" w:w="3402"/>
           </w:tcPr>
           <w:p>
@@ -1484,40 +1454,10 @@
               <w:rPr>
                 <w:sz w:val="19"/>
               </w:rPr>
-              <w:t>Custom Day Off (Wk2 Tue, Yr2)</w:t>
-            </w:r>
-          </w:p>
-        </w:tc>
-        <w:tc>
-          <w:tcPr>
-            <w:tcW w:type="dxa" w:w="3118"/>
-          </w:tcPr>
-          <w:p>
-            <w:r/>
-            <w:r>
-              <w:rPr>
-                <w:sz w:val="19"/>
-              </w:rPr>
-              <w:t>gStartDate + 1Y + 1W + 1D</w:t>
-            </w:r>
-          </w:p>
-        </w:tc>
-        <w:tc>
-          <w:tcPr>
-            <w:tcW w:type="dxa" w:w="3685"/>
-          </w:tcPr>
-          <w:p>
-            <w:r/>
-            <w:r>
-              <w:rPr>
-                <w:sz w:val="19"/>
-              </w:rPr>
-              <w:t>Same pattern, one year later</w:t>
-            </w:r>
-          </w:p>
-        </w:tc>
-      </w:tr>
-      <w:tr>
+              <w:t>MonthAnchor + 4W</w:t>
+            </w:r>
+          </w:p>
+        </w:tc>
         <w:tc>
           <w:tcPr>
             <w:tcW w:type="dxa" w:w="3402"/>
@@ -1528,129 +1468,18 @@
               <w:rPr>
                 <w:sz w:val="19"/>
               </w:rPr>
-              <w:t>Custom Day Off (Wk3 Wed, Yr2)</w:t>
-            </w:r>
-          </w:p>
-        </w:tc>
-        <w:tc>
-          <w:tcPr>
-            <w:tcW w:type="dxa" w:w="3118"/>
-          </w:tcPr>
-          <w:p>
-            <w:r/>
-            <w:r>
-              <w:rPr>
-                <w:sz w:val="19"/>
-              </w:rPr>
-              <w:t>gStartDate + 1Y + 2W + 2D</w:t>
-            </w:r>
-          </w:p>
-        </w:tc>
-        <w:tc>
-          <w:tcPr>
-            <w:tcW w:type="dxa" w:w="3685"/>
-          </w:tcPr>
-          <w:p>
-            <w:r/>
-            <w:r>
-              <w:rPr>
-                <w:sz w:val="19"/>
-              </w:rPr>
-              <w:t>Same pattern, one year later</w:t>
-            </w:r>
-          </w:p>
-        </w:tc>
-      </w:tr>
-      <w:tr>
-        <w:tc>
-          <w:tcPr>
-            <w:tcW w:type="dxa" w:w="3402"/>
-          </w:tcPr>
-          <w:p>
-            <w:r/>
-            <w:r>
-              <w:rPr>
-                <w:sz w:val="19"/>
-              </w:rPr>
-              <w:t>Custom Day Off (Wk3 Thu, Yr2)</w:t>
-            </w:r>
-          </w:p>
-        </w:tc>
-        <w:tc>
-          <w:tcPr>
-            <w:tcW w:type="dxa" w:w="3118"/>
-          </w:tcPr>
-          <w:p>
-            <w:r/>
-            <w:r>
-              <w:rPr>
-                <w:sz w:val="19"/>
-              </w:rPr>
-              <w:t>gStartDate + 1Y + 2W + 3D</w:t>
-            </w:r>
-          </w:p>
-        </w:tc>
-        <w:tc>
-          <w:tcPr>
-            <w:tcW w:type="dxa" w:w="3685"/>
-          </w:tcPr>
-          <w:p>
-            <w:r/>
-            <w:r>
-              <w:rPr>
-                <w:sz w:val="19"/>
-              </w:rPr>
-              <w:t>Same pattern, one year later</w:t>
-            </w:r>
-          </w:p>
-        </w:tc>
-      </w:tr>
-      <w:tr>
-        <w:tc>
-          <w:tcPr>
-            <w:tcW w:type="dxa" w:w="3402"/>
-          </w:tcPr>
-          <w:p>
-            <w:r/>
-            <w:r>
-              <w:rPr>
-                <w:sz w:val="19"/>
-              </w:rPr>
-              <w:t>Custom Day Off (Wk5 Mon, Yr2)</w:t>
-            </w:r>
-          </w:p>
-        </w:tc>
-        <w:tc>
-          <w:tcPr>
-            <w:tcW w:type="dxa" w:w="3118"/>
-          </w:tcPr>
-          <w:p>
-            <w:r/>
-            <w:r>
-              <w:rPr>
-                <w:sz w:val="19"/>
-              </w:rPr>
-              <w:t>gStartDate + 1Y + 4W</w:t>
-            </w:r>
-          </w:p>
-        </w:tc>
-        <w:tc>
-          <w:tcPr>
-            <w:tcW w:type="dxa" w:w="3685"/>
-          </w:tcPr>
-          <w:p>
-            <w:r/>
-            <w:r>
-              <w:rPr>
-                <w:sz w:val="19"/>
-              </w:rPr>
-              <w:t>Same pattern, one year later</w:t>
+              <w:t>Monday of week 5 relative to each 4-week block</w:t>
             </w:r>
           </w:p>
         </w:tc>
       </w:tr>
     </w:tbl>
     <w:p/>
+    <w:p>
+      <w:r>
+        <w:t>Where MonthAnchor = CalcDate('+%1W', MonthIndex × 4, gStartDate) for MonthIndex 0 to 35 — 144 rows total (4 patterns × 36 iterations). Description text is reused identically across all 36 occurrences of each pattern (e.g. every “Wk2 Tue” row is literally titled “Custom Day Off (Wk2 Tue)”) — harmless, since Base Calendar Change's primary key is Base Calendar Code + Recurring System + Date + Day, not Description.</w:t>
+      </w:r>
+    </w:p>
     <w:p>
       <w:r>
         <w:rPr>
@@ -1658,7 +1487,7 @@
           <w:color w:val="555555"/>
           <w:sz w:val="19"/>
         </w:rPr>
-        <w:t>Note: These deliberately do NOT use Recurring System, even though there are now two yearly occurrences: they're offset from THIS run's rolling gStartDate (different every time the codeunit runs), not a fixed calendar month/day or weekday, so neither “Annual Recurring” nor “Weekly Recurring” can express “week 2 Tuesday of whatever window this run computes.” Generating explicit dated rows for both years is the correct approach here, not a workaround.</w:t>
+        <w:t>Note: These deliberately do NOT use Recurring System: they're offsets from THIS run's rolling gStartDate (different every time the codeunit runs), not a fixed calendar month/day or weekday, so neither “Annual Recurring” nor “Weekly Recurring” can express “week 2 Tuesday of whatever window this run computes.” Generating explicit dated rows is the correct approach here, not a workaround. (Two earlier, more elaborate revisions — a single 2nd-Tuesday-of-month pick, then a full Nth-weekday-of-calendar-month engine with 4 patterns × true Jan–Dec months — were tried and superseded in favor of this simpler week-block version, per direct user guidance.)</w:t>
       </w:r>
     </w:p>
     <w:p>
@@ -1666,12 +1495,35 @@
         <w:pStyle w:val="Heading2"/>
       </w:pPr>
       <w:r>
-        <w:t>4.3 How the calendar actually suppresses generation</w:t>
+        <w:t>4.3 Weekly weekend markers (NEW — makes DEMOCAL self-sufficient)</w:t>
       </w:r>
     </w:p>
     <w:p>
       <w:r>
-        <w:t>The core working-day check (IsWorkingDay) was extended this cycle: it still checks the Work-Hour Template's weekday flags first (fast path, unchanged), and — only if that says the weekday is normally working — ALSO checks DEMOCAL's Base Calendar Change exceptions via standard BC codeunit “Calendar Management” (SetSource + IsNonworkingDay), loaded and cached ONCE per run for performance (this check fires tens of thousands of times). This means both Resource Capacity Entry generation and Day Planning generation now correctly skip Dutch holidays and the 4 custom days off.</w:t>
+        <w:t>Two additional rows mark Saturday and Sunday as non-working via BC's native “Weekly Recurring” option — “Recurring System” = Weekly Recurring, Day = Saturday/Sunday respectively, Nonworking = true, blank Date and Description. Confirmed via the same base-app decompilation technique: table 7601's Day field OptionMembers are " ",Monday,Tuesday,Wednesday,Thursday,Friday,Saturday,Sunday → 0=blank, 1=Monday .. 7=Sunday (numerically matches this codeunit's own Date2DWY convention, confirmed rather than assumed).</w:t>
+      </w:r>
+    </w:p>
+    <w:p>
+      <w:r>
+        <w:rPr>
+          <w:i/>
+          <w:color w:val="555555"/>
+          <w:sz w:val="19"/>
+        </w:rPr>
+        <w:t>Note: Why this was needed even though weekends were already excluded: this codeunit's own IsWorkingDay() already treats Saturday/Sunday as non-working via the separate Work-Hour Template check, which runs BEFORE it ever consults DEMOCAL — so nothing this codeunit generates was ever affected. But without these 2 rows, DEMOCAL itself had no exception marking weekends non-working, so any OTHER code elsewhere in the app that queries DEMOCAL's calendar directly (Calendar Management.IsNonworkingDay()/SetSource() against DEMOCAL alone) would have incorrectly treated Saturdays/Sundays as working days. This makes DEMOCAL correct as a standalone calendar object, not just correct when paired with this codeunit's own generation logic.</w:t>
+      </w:r>
+    </w:p>
+    <w:p>
+      <w:pPr>
+        <w:pStyle w:val="Heading2"/>
+      </w:pPr>
+      <w:r>
+        <w:t>4.4 How the calendar actually suppresses generation</w:t>
+      </w:r>
+    </w:p>
+    <w:p>
+      <w:r>
+        <w:t>The core working-day check (IsWorkingDay) was extended this cycle: it still checks the Work-Hour Template's weekday flags first (fast path, unchanged), and — only if that says the weekday is normally working — ALSO checks DEMOCAL's Base Calendar Change exceptions via standard BC codeunit “Calendar Management” (SetSource + IsNonworkingDay), loaded and cached ONCE per run for performance (this check fires tens of thousands of times). This means both Resource Capacity Entry generation and Day Planning generation now correctly skip Dutch holidays, all 144 custom days off, and weekends (belt-and-suspenders with the Work-Hour Template check, now that DEMOCAL also encodes weekends itself).</w:t>
       </w:r>
     </w:p>
     <w:p>
@@ -4516,7 +4368,7 @@
     </w:p>
     <w:p>
       <w:r>
-        <w:t>Unchanged mechanics from before this cycle (randomized 8–24h/day, 07:00 start, two generation paths — the small gRes[1..6] set and the DRP*/DRM* demo pool). The only functional change: since IsWorkingDay() now also excludes DEMOCAL's holidays/custom days off (Section 4.3), the number of capacity rows generated per resource is slightly lower than a pure weekday count would suggest — see Section 13 for the adjusted estimate.</w:t>
+        <w:t>Unchanged mechanics from before this cycle (randomized 8–24h/day, 07:00 start, two generation paths — the small gRes[1..6] set and the DRP*/DRM* demo pool). The only functional change: since IsWorkingDay() now also excludes DEMOCAL's holidays/custom days off (Section 4.4), the number of capacity rows generated per resource is slightly lower than a pure weekday count would suggest — see Section 13 for the adjusted estimate.</w:t>
       </w:r>
     </w:p>
     <w:p>
@@ -4529,7 +4381,7 @@
     </w:p>
     <w:p>
       <w:r>
-        <w:t>Unchanged from before this cycle for the showcase and bulk jobs: leader/member lines, the weekday-varied Requested-vs-Assigned hour pattern, Plan Status by date, the 3-lines/resource/day cap, and the weekly-guarantee fallback. The only functional change here too is that IsWorkingDay() now also honors DEMOCAL, so Day Planning is correctly skipped on Dutch holidays and the 4 custom days off, in addition to weekends.</w:t>
+        <w:t>Unchanged from before this cycle for the showcase and bulk jobs: leader/member lines, the weekday-varied Requested-vs-Assigned hour pattern, Plan Status by date, the 3-lines/resource/day cap, and the weekly-guarantee fallback. The only functional change here too is that IsWorkingDay() now also honors DEMOCAL, so Day Planning is correctly skipped on Dutch holidays and all 144 custom days off, in addition to weekends.</w:t>
       </w:r>
     </w:p>
     <w:p>
@@ -4586,7 +4438,7 @@
         <w:pStyle w:val="Heading2"/>
       </w:pPr>
       <w:r>
-        <w:t>13.1 Tier 1 — Exact / deterministic (5,926 records)</w:t>
+        <w:t>13.1 Tier 1 — Exact / deterministic (6,064 records)</w:t>
       </w:r>
     </w:p>
     <w:p>
@@ -4992,7 +4844,7 @@
               <w:rPr>
                 <w:sz w:val="19"/>
               </w:rPr>
-              <w:t>≈ 25</w:t>
+              <w:t>≈ 163</w:t>
             </w:r>
           </w:p>
         </w:tc>
@@ -5006,7 +4858,7 @@
               <w:rPr>
                 <w:sz w:val="19"/>
               </w:rPr>
-              <w:t>4 fixed-date holidays (Annual Recurring, always inserted once each) + ≈12-13 movable-date holidays landing inside the current window (of 36 dated rows in the CSV, spanning 2025-2030) + 8 custom days off (4 patterns x 2 years) — the movable-holiday count shifts by ±a few depending on exactly which calendar years the rolling window touches</w:t>
+              <w:t>4 fixed-date holidays (Annual Recurring, always inserted once each) + ≈12-13 movable-date holidays landing inside the current window (of 36 dated rows in the CSV, spanning 2025-2030) + 144 custom days-off (4 patterns x 36 four-week iterations, ≈3 years, always inserted regardless of window) + 2 weekly-recurring weekend markers (Saturday/Sunday) — the movable-holiday count shifts by ±a few depending on exactly which calendar years the rolling window touches</w:t>
             </w:r>
           </w:p>
         </w:tc>
@@ -5574,7 +5426,7 @@
               <w:rPr>
                 <w:sz w:val="19"/>
               </w:rPr>
-              <w:t>5,926</w:t>
+              <w:t>6,064</w:t>
             </w:r>
           </w:p>
         </w:tc>
@@ -5845,7 +5697,7 @@
         <w:t>Calendar data model refinement</w:t>
       </w:r>
       <w:r>
-        <w:t xml:space="preserve"> — split the 10 Dutch holidays into fixed-date (now Annual Recurring, 1 row each) vs movable-date (unchanged per-year rows) instead of treating all 10 the same way; extended the custom demo days-off from 4 one-time rows to 8 (repeated one year later), since those can't use Recurring System at all — see Section 4.</w:t>
+        <w:t xml:space="preserve"> — split the 10 Dutch holidays into fixed-date (now Annual Recurring, 1 row each) vs movable-date (unchanged per-year rows) instead of treating all 10 the same way; expanded the custom demo days-off to 144 rows (4 patterns looped every 4 weeks for ~3 years), since those can't use Recurring System at all; added 2 Weekly Recurring weekend markers so DEMOCAL is correct as a standalone calendar object — see Section 4.</w:t>
       </w:r>
     </w:p>
     <w:sectPr>

</xml_diff>